<commit_message>
Nieuwe header en titel aangepast
</commit_message>
<xml_diff>
--- a/Debriefing HvanA.docx
+++ b/Debriefing HvanA.docx
@@ -47,14 +47,31 @@
           <w:bCs/>
           <w:u w:val="single" w:color="000000"/>
         </w:rPr>
-        <w:t>Debriefing HvanA</w:t>
-      </w:r>
+        <w:t xml:space="preserve">Debriefing </w:t>
+      </w:r>
+      <w:proofErr w:type="spellStart"/>
       <w:r>
         <w:rPr>
           <w:b/>
           <w:bCs/>
+          <w:u w:val="single" w:color="000000"/>
+        </w:rPr>
+        <w:t>HvanA</w:t>
+      </w:r>
+      <w:proofErr w:type="spellEnd"/>
+      <w:r>
+        <w:rPr>
+          <w:b/>
+          <w:bCs/>
         </w:rPr>
         <w:t xml:space="preserve"> </w:t>
+      </w:r>
+      <w:r>
+        <w:rPr>
+          <w:b/>
+          <w:bCs/>
+        </w:rPr>
+        <w:t>(verwerkte feedback).</w:t>
       </w:r>
     </w:p>
     <w:p>
@@ -74,8 +91,9 @@
           <w:u w:val="single"/>
           <w:lang w:val="fr-FR"/>
         </w:rPr>
-        <w:t>Marian, Rayhana, Beyza, Justin, Jesper, Mirial</w:t>
-      </w:r>
+        <w:t xml:space="preserve">Marian, Rayhana, Beyza, Justin, Jesper, </w:t>
+      </w:r>
+      <w:proofErr w:type="spellStart"/>
       <w:r>
         <w:rPr>
           <w:i/>
@@ -83,8 +101,18 @@
           <w:u w:val="single"/>
           <w:lang w:val="fr-FR"/>
         </w:rPr>
+        <w:t>Mirial</w:t>
+      </w:r>
+      <w:r>
+        <w:rPr>
+          <w:i/>
+          <w:iCs/>
+          <w:u w:val="single"/>
+          <w:lang w:val="fr-FR"/>
+        </w:rPr>
         <w:t>e</w:t>
       </w:r>
+      <w:proofErr w:type="spellEnd"/>
       <w:r>
         <w:rPr>
           <w:i/>
@@ -224,25 +252,35 @@
     </w:p>
     <w:p>
       <w:pPr>
-        <w:ind w:left="0"/>
-      </w:pPr>
-      <w:r>
-        <w:t>HvanA bestaat acht jaren. De website was eerst een Lara</w:t>
-      </w:r>
-      <w:r>
-        <w:t>v</w:t>
-      </w:r>
-      <w:r>
-        <w:t xml:space="preserve">el project en momenteel is het een Wordpress-website. Het platform is onafhankelijk, de mensen die er werken zijn niet in dienst van de Hogeschool van Amsterdam. Ze krijgen wel subsidie van de HvA.  </w:t>
-      </w:r>
-    </w:p>
-    <w:p>
-      <w:pPr>
         <w:spacing w:after="185" w:line="259" w:lineRule="auto"/>
         <w:ind w:left="5" w:firstLine="0"/>
       </w:pPr>
-      <w:r>
-        <w:t xml:space="preserve"> </w:t>
+      <w:proofErr w:type="spellStart"/>
+      <w:r>
+        <w:t>HvanA</w:t>
+      </w:r>
+      <w:proofErr w:type="spellEnd"/>
+      <w:r>
+        <w:t xml:space="preserve"> bestaat acht jaren. De website was eerst een Lara Vel project en momenteel is het een </w:t>
+      </w:r>
+      <w:proofErr w:type="spellStart"/>
+      <w:r>
+        <w:t>Wordpress</w:t>
+      </w:r>
+      <w:proofErr w:type="spellEnd"/>
+      <w:r>
+        <w:t>-website. Het platform is onafhankelijk, de mensen die er werken zijn niet in dienst van de Hogeschool van Amsterdam. Ze krijgen wel subsidie van de</w:t>
+      </w:r>
+      <w:r>
+        <w:br/>
+      </w:r>
+      <w:proofErr w:type="spellStart"/>
+      <w:r>
+        <w:t>HvA</w:t>
+      </w:r>
+      <w:proofErr w:type="spellEnd"/>
+      <w:r>
+        <w:t>.</w:t>
       </w:r>
     </w:p>
     <w:p>
@@ -269,80 +307,28 @@
       <w:pPr>
         <w:ind w:left="0"/>
       </w:pPr>
-      <w:r>
-        <w:t xml:space="preserve">HvanA wil meer bereik naar de website en dat de website aantrekkelijker is voor studenten.  </w:t>
-      </w:r>
-    </w:p>
-    <w:p>
-      <w:pPr>
-        <w:ind w:left="0"/>
-      </w:pPr>
-      <w:r>
-        <w:t xml:space="preserve">De website is het visitekaartje van HvanA. Je vindt hier twee keer per dag, nieuws(artikelen) over de school/docenten, columns, video en de podcast. </w:t>
-      </w:r>
-    </w:p>
-    <w:p>
-      <w:pPr>
-        <w:ind w:left="0"/>
-        <w:rPr>
-          <w:color w:val="EE0000"/>
-        </w:rPr>
-      </w:pPr>
-      <w:r>
-        <w:rPr>
-          <w:b/>
-          <w:bCs/>
-          <w:color w:val="EE0000"/>
-        </w:rPr>
-        <w:t>HvanA wil onderzoeken hoe hvana.nl voor studenten van de Hogeschool van Amsterdam een aantrekkelijkere en relevantere bestemming kan worden. Studenten komen nu relatief weinig rechtstreeks naar de website, terwijl journalistieke content via sociale media wel door studenten wordt bekeken. De opdracht is om te onderzoeken welke belemmeringen en behoeften daarbij een rol spelen en op basis daarvan een verbeterd ontwerp voor de website te ontwikkelen.</w:t>
-      </w:r>
-    </w:p>
-    <w:p>
-      <w:pPr>
-        <w:ind w:left="0"/>
-      </w:pPr>
-      <w:r>
-        <w:t> </w:t>
-      </w:r>
-    </w:p>
-    <w:p>
-      <w:pPr>
-        <w:ind w:left="0"/>
-      </w:pPr>
-    </w:p>
-    <w:p>
-      <w:pPr>
-        <w:ind w:left="0"/>
-      </w:pPr>
-    </w:p>
-    <w:p>
-      <w:pPr>
-        <w:ind w:left="0"/>
-      </w:pPr>
-    </w:p>
-    <w:p>
-      <w:pPr>
-        <w:ind w:left="0"/>
-      </w:pPr>
-    </w:p>
-    <w:p>
-      <w:pPr>
-        <w:ind w:left="0"/>
-      </w:pPr>
-    </w:p>
-    <w:p>
-      <w:pPr>
-        <w:ind w:left="0"/>
-      </w:pPr>
+      <w:proofErr w:type="spellStart"/>
+      <w:r>
+        <w:t>HvanA</w:t>
+      </w:r>
+      <w:proofErr w:type="spellEnd"/>
+      <w:r>
+        <w:t xml:space="preserve"> wil onderzoeken hoe hvana.nl voor studenten van de HVA een aantrekkelijke en relevantere bestemming kan worden. (hiermee wordt bedoeld dat studenten nu relatief weinig rechtstreeks op de site terechtkomen, terwijl journalistieke content wel via andere platforms, zoals sociale media, door studenten wordt bekeken.) Hier wil </w:t>
+      </w:r>
+      <w:proofErr w:type="spellStart"/>
+      <w:r>
+        <w:t>HvanA</w:t>
+      </w:r>
+      <w:proofErr w:type="spellEnd"/>
+      <w:r>
+        <w:t xml:space="preserve"> verandering in proberen te brengen. Welke belemmeringen en behoeften spelen hierbij een rol? Op basis hiervan ontwikkelen wij een verbeterd ontwerp voor de website.</w:t>
+      </w:r>
     </w:p>
     <w:p>
       <w:pPr>
         <w:spacing w:after="186" w:line="259" w:lineRule="auto"/>
-        <w:ind w:left="5" w:firstLine="0"/>
-      </w:pPr>
-      <w:r>
-        <w:t xml:space="preserve"> </w:t>
-      </w:r>
+        <w:ind w:left="0" w:firstLine="0"/>
+      </w:pPr>
     </w:p>
     <w:p>
       <w:pPr>
@@ -361,26 +347,71 @@
           <w:b/>
           <w:bCs/>
         </w:rPr>
-        <w:lastRenderedPageBreak/>
         <w:t xml:space="preserve">Aanleiding </w:t>
       </w:r>
     </w:p>
     <w:p>
       <w:pPr>
-        <w:spacing w:after="8"/>
-        <w:ind w:left="0"/>
-      </w:pPr>
-      <w:r>
-        <w:t xml:space="preserve">Op het moment komen er meer medewerkers dan studenten van de HvA naar de website, terwijl de content ook relevant is voor studenten.  </w:t>
-      </w:r>
-    </w:p>
-    <w:p>
-      <w:pPr>
-        <w:ind w:left="0"/>
-      </w:pPr>
-      <w:r>
-        <w:t xml:space="preserve">De opdrachtgever krijgt meer views via bijvoorbeeld LinkedIn, Instagram en tiktok dan op de website. Dit terwijl de website het visitekaartje is.  </w:t>
-      </w:r>
+        <w:spacing w:after="186" w:line="259" w:lineRule="auto"/>
+        <w:ind w:left="5" w:firstLine="0"/>
+      </w:pPr>
+      <w:r>
+        <w:t xml:space="preserve">Voor </w:t>
+      </w:r>
+      <w:proofErr w:type="spellStart"/>
+      <w:r>
+        <w:t>HvanA</w:t>
+      </w:r>
+      <w:proofErr w:type="spellEnd"/>
+      <w:r>
+        <w:t xml:space="preserve"> zijn primair studenten en medewerker van de </w:t>
+      </w:r>
+      <w:proofErr w:type="spellStart"/>
+      <w:r>
+        <w:t>HvA</w:t>
+      </w:r>
+      <w:proofErr w:type="spellEnd"/>
+      <w:r>
+        <w:t xml:space="preserve"> de doelgroepen. Onderwijskundige zijn een deel van die tweede groep. Op dit moment wordt de site merendeels bekeken door medewerkers van de </w:t>
+      </w:r>
+      <w:proofErr w:type="spellStart"/>
+      <w:r>
+        <w:t>HvA</w:t>
+      </w:r>
+      <w:proofErr w:type="spellEnd"/>
+      <w:r>
+        <w:t xml:space="preserve"> en van andere hogescholen.</w:t>
+      </w:r>
+    </w:p>
+    <w:p>
+      <w:pPr>
+        <w:spacing w:after="186" w:line="259" w:lineRule="auto"/>
+        <w:ind w:left="5" w:firstLine="0"/>
+      </w:pPr>
+    </w:p>
+    <w:p>
+      <w:pPr>
+        <w:spacing w:after="186" w:line="259" w:lineRule="auto"/>
+        <w:ind w:left="5" w:firstLine="0"/>
+      </w:pPr>
+    </w:p>
+    <w:p>
+      <w:pPr>
+        <w:spacing w:after="186" w:line="259" w:lineRule="auto"/>
+        <w:ind w:left="5" w:firstLine="0"/>
+      </w:pPr>
+    </w:p>
+    <w:p>
+      <w:pPr>
+        <w:spacing w:after="186" w:line="259" w:lineRule="auto"/>
+        <w:ind w:left="5" w:firstLine="0"/>
+      </w:pPr>
+    </w:p>
+    <w:p>
+      <w:pPr>
+        <w:spacing w:after="186" w:line="259" w:lineRule="auto"/>
+        <w:ind w:left="5" w:firstLine="0"/>
+      </w:pPr>
     </w:p>
     <w:p>
       <w:pPr>
@@ -412,6 +443,7 @@
           <w:b/>
           <w:bCs/>
         </w:rPr>
+        <w:lastRenderedPageBreak/>
         <w:t xml:space="preserve">Doelstelling </w:t>
       </w:r>
     </w:p>
@@ -422,146 +454,134 @@
     </w:p>
     <w:p>
       <w:pPr>
-        <w:pStyle w:val="Lijstalinea"/>
         <w:numPr>
           <w:ilvl w:val="0"/>
-          <w:numId w:val="6"/>
+          <w:numId w:val="13"/>
         </w:numPr>
-        <w:spacing w:after="14"/>
-        <w:rPr>
-          <w:color w:val="EE0000"/>
-        </w:rPr>
-      </w:pPr>
-      <w:r>
-        <w:t xml:space="preserve">Meer views </w:t>
-      </w:r>
-      <w:r>
-        <w:rPr>
-          <w:color w:val="EE0000"/>
-        </w:rPr>
-        <w:t>(Voor HvanA zijn primair studenten en medewerkers van de HvA de doelgroepen. Onderwijskundigen zijn een deel van die tweede groep.)</w:t>
-      </w:r>
-    </w:p>
-    <w:p>
-      <w:pPr>
-        <w:pStyle w:val="Lijstalinea"/>
+        <w:spacing w:after="0" w:line="259" w:lineRule="auto"/>
+      </w:pPr>
+      <w:r>
+        <w:t>Studenten bereiken de journalistiek wel via sociale platforms, maar relatief weinig via hvana.nl</w:t>
+      </w:r>
+    </w:p>
+    <w:p>
+      <w:pPr>
         <w:numPr>
           <w:ilvl w:val="0"/>
-          <w:numId w:val="6"/>
+          <w:numId w:val="13"/>
         </w:numPr>
-        <w:spacing w:after="14"/>
-        <w:rPr>
-          <w:color w:val="EE0000"/>
-        </w:rPr>
-      </w:pPr>
-      <w:r>
-        <w:t>Aantrekkelijker maken voor studenten</w:t>
-      </w:r>
-      <w:r>
-        <w:t>.</w:t>
-      </w:r>
-    </w:p>
-    <w:p>
-      <w:pPr>
-        <w:pStyle w:val="Lijstalinea"/>
+        <w:spacing w:after="0" w:line="259" w:lineRule="auto"/>
+      </w:pPr>
+      <w:proofErr w:type="spellStart"/>
+      <w:r>
+        <w:t>Hvana</w:t>
+      </w:r>
+      <w:proofErr w:type="spellEnd"/>
+      <w:r>
+        <w:t xml:space="preserve"> een aantrekkelijke bestemming maken</w:t>
+      </w:r>
+    </w:p>
+    <w:p>
+      <w:pPr>
         <w:numPr>
           <w:ilvl w:val="0"/>
-          <w:numId w:val="6"/>
+          <w:numId w:val="13"/>
         </w:numPr>
-        <w:spacing w:after="18"/>
-        <w:rPr>
-          <w:color w:val="EE0000"/>
-        </w:rPr>
-      </w:pPr>
-      <w:r>
-        <w:t xml:space="preserve">Betere zoek-/filterfunctie </w:t>
-      </w:r>
-      <w:r>
-        <w:rPr>
-          <w:color w:val="EE0000"/>
-        </w:rPr>
-        <w:t xml:space="preserve">(Hetzelfde geldt voor de </w:t>
-      </w:r>
-      <w:r>
+        <w:spacing w:after="0" w:line="259" w:lineRule="auto"/>
+      </w:pPr>
+      <w:r>
+        <w:t>Een relevantere website voor studenten</w:t>
+      </w:r>
+    </w:p>
+    <w:p>
+      <w:pPr>
+        <w:numPr>
+          <w:ilvl w:val="0"/>
+          <w:numId w:val="13"/>
+        </w:numPr>
+        <w:spacing w:after="0" w:line="259" w:lineRule="auto"/>
+      </w:pPr>
+      <w:r>
+        <w:t>Meer bezoek vanuit andere kanalen naar de website</w:t>
+      </w:r>
+    </w:p>
+    <w:p>
+      <w:pPr>
+        <w:numPr>
+          <w:ilvl w:val="0"/>
+          <w:numId w:val="13"/>
+        </w:numPr>
+        <w:spacing w:after="0" w:line="259" w:lineRule="auto"/>
+      </w:pPr>
+      <w:r>
+        <w:t>Betere zoek-/filterfunctie</w:t>
+      </w:r>
+    </w:p>
+    <w:p>
+      <w:pPr>
+        <w:spacing w:after="0" w:line="259" w:lineRule="auto"/>
+        <w:ind w:left="360" w:firstLine="0"/>
+      </w:pPr>
+    </w:p>
+    <w:p>
+      <w:pPr>
+        <w:spacing w:after="186" w:line="259" w:lineRule="auto"/>
+        <w:ind w:left="5" w:firstLine="0"/>
         <w:rPr>
           <w:b/>
           <w:bCs/>
-          <w:color w:val="EE0000"/>
-        </w:rPr>
-        <w:t>zoek-/filterfunctie</w:t>
-      </w:r>
-      <w:r>
-        <w:rPr>
-          <w:color w:val="EE0000"/>
-        </w:rPr>
-        <w:t>. Die kan slecht zijn, maar dat is nog niet aangetoond als belangrijke oorzaak van het probleem.)</w:t>
-      </w:r>
-    </w:p>
-    <w:p>
-      <w:pPr>
-        <w:pStyle w:val="Lijstalinea"/>
-        <w:numPr>
-          <w:ilvl w:val="0"/>
-          <w:numId w:val="6"/>
-        </w:numPr>
-        <w:spacing w:after="117"/>
-        <w:rPr>
-          <w:color w:val="EE0000"/>
-        </w:rPr>
-      </w:pPr>
-      <w:r>
-        <w:t xml:space="preserve">Populair nieuws voor studenten bovenaan de pagina </w:t>
-      </w:r>
-      <w:r>
-        <w:rPr>
-          <w:color w:val="EE0000"/>
-        </w:rPr>
-        <w:t>(</w:t>
-      </w:r>
+          <w:i/>
+          <w:iCs/>
+        </w:rPr>
+      </w:pPr>
       <w:r>
         <w:rPr>
           <w:b/>
           <w:bCs/>
-          <w:color w:val="EE0000"/>
-        </w:rPr>
-        <w:t>“Populair nieuws voor studenten bovenaan” is al een oplossing.</w:t>
-      </w:r>
-      <w:r>
-        <w:rPr>
-          <w:color w:val="EE0000"/>
-        </w:rPr>
-        <w:t xml:space="preserve"> Dat kan uit onderzoek komen, maar hoort eigenlijk niet vooraf als eis vast te staan. Misschien blijkt bijvoorbeeld actualiteit, personalisatie, video, navigatie of thematische ingangen belangrijker.)</w:t>
-      </w:r>
-    </w:p>
-    <w:p>
-      <w:pPr>
-        <w:pStyle w:val="Lijstalinea"/>
-        <w:spacing w:after="14"/>
-        <w:ind w:left="350" w:firstLine="0"/>
+          <w:i/>
+          <w:iCs/>
+        </w:rPr>
+        <w:t xml:space="preserve">Concrete doel: Het ontwerp moet studenten sneller laten begrijpen wat </w:t>
+      </w:r>
+      <w:proofErr w:type="spellStart"/>
+      <w:r>
         <w:rPr>
           <w:b/>
           <w:bCs/>
-          <w:color w:val="EE0000"/>
-        </w:rPr>
-      </w:pPr>
-    </w:p>
-    <w:p>
-      <w:pPr>
-        <w:spacing w:after="186" w:line="259" w:lineRule="auto"/>
-        <w:ind w:left="5" w:firstLine="0"/>
+          <w:i/>
+          <w:iCs/>
+        </w:rPr>
+        <w:t>HvanA</w:t>
+      </w:r>
+      <w:proofErr w:type="spellEnd"/>
+      <w:r>
         <w:rPr>
           <w:b/>
           <w:bCs/>
-          <w:color w:val="EE0000"/>
-        </w:rPr>
-      </w:pPr>
+          <w:i/>
+          <w:iCs/>
+        </w:rPr>
+        <w:t xml:space="preserve"> hun te bieden heeft, relevante content beter vindbaar en aantrekkelijk presenteren en de mobiele gebruikservaring verbeteren. Daarbij moet rekening worden gehouden met de journalistieke onafhankelijkheid en eigen identiteit van </w:t>
+      </w:r>
+      <w:proofErr w:type="spellStart"/>
       <w:r>
         <w:rPr>
           <w:b/>
           <w:bCs/>
-          <w:color w:val="EE0000"/>
-        </w:rPr>
-        <w:t>Het ontwerp moet studenten sneller laten begrijpen wat HvanA hun te bieden heeft, relevante content beter vindbaar en aantrekkelijk presenteren en de mobiele gebruikservaring verbeteren. Daarbij moet rekening worden gehouden met de journalistieke onafhankelijkheid en eigen identiteit van HvanA.</w:t>
+          <w:i/>
+          <w:iCs/>
+        </w:rPr>
+        <w:t>HvanA</w:t>
+      </w:r>
+      <w:proofErr w:type="spellEnd"/>
+      <w:r>
+        <w:rPr>
+          <w:b/>
+          <w:bCs/>
+          <w:i/>
+          <w:iCs/>
+        </w:rPr>
+        <w:t>.</w:t>
       </w:r>
     </w:p>
     <w:p>
@@ -592,121 +612,31 @@
     </w:p>
     <w:p>
       <w:pPr>
-        <w:rPr>
-          <w:color w:val="EE0000"/>
-        </w:rPr>
-      </w:pPr>
-      <w:r>
-        <w:t>Wij maken de website in de H</w:t>
-      </w:r>
-      <w:r>
-        <w:t>van</w:t>
-      </w:r>
-      <w:r>
-        <w:t>A-huisstijl</w:t>
-      </w:r>
-      <w:r>
-        <w:t xml:space="preserve">. </w:t>
-      </w:r>
-      <w:r>
-        <w:t>Waarvan de toegankelijkheid, responsiveness  en performance is verbeterd ten opzichte van de huidige. Dit zal resulteren in meer engagement naar de website onder studenten</w:t>
-      </w:r>
-      <w:r>
-        <w:rPr>
-          <w:color w:val="EE0000"/>
-        </w:rPr>
-        <w:t>.</w:t>
-      </w:r>
-      <w:r>
-        <w:rPr>
-          <w:color w:val="EE0000"/>
-        </w:rPr>
-        <w:t>(</w:t>
-      </w:r>
-      <w:r>
-        <w:rPr>
-          <w:color w:val="EE0000"/>
-        </w:rPr>
-        <w:t xml:space="preserve"> </w:t>
-      </w:r>
-      <w:r>
-        <w:rPr>
-          <w:b/>
-          <w:bCs/>
-          <w:color w:val="EE0000"/>
-        </w:rPr>
-        <w:t>“Dit zal resulteren in meer engagement onder studenten”</w:t>
-      </w:r>
-      <w:r>
-        <w:rPr>
-          <w:color w:val="EE0000"/>
-        </w:rPr>
-        <w:t xml:space="preserve"> kun je niet beloven. Wel een ontwerp maken waarvan op basis van onderzoek en tests aannemelijk is dat het de gebruikservaring verbetert. Of het daadwerkelijk meer bereik oplevert, moet ik daarna meten</w:t>
-      </w:r>
-      <w:r>
-        <w:rPr>
-          <w:color w:val="EE0000"/>
-        </w:rPr>
-        <w:t xml:space="preserve">). </w:t>
-      </w:r>
-    </w:p>
-    <w:p>
-      <w:pPr>
         <w:ind w:left="0" w:firstLine="0"/>
       </w:pPr>
-    </w:p>
-    <w:p>
-      <w:pPr>
-        <w:ind w:left="0"/>
-      </w:pPr>
-      <w:r>
-        <w:t xml:space="preserve">Ook ontwikkelen we een aantal nieuwe features en verrijken we de gebruikerservaring.  </w:t>
-      </w:r>
-    </w:p>
-    <w:p>
-      <w:pPr>
-        <w:spacing w:after="12"/>
-        <w:ind w:left="0"/>
-      </w:pPr>
-      <w:r>
-        <w:t xml:space="preserve">We verbeteren de zoek- en filterfunctie zodat er betere suggesties naar voren komen. </w:t>
-      </w:r>
-    </w:p>
-    <w:p>
-      <w:pPr>
-        <w:ind w:left="0"/>
-      </w:pPr>
-      <w:r>
-        <w:t xml:space="preserve">(indien mogelijk) </w:t>
-      </w:r>
-    </w:p>
-    <w:p>
-      <w:pPr>
-        <w:ind w:left="0"/>
-      </w:pPr>
-      <w:r>
-        <w:t xml:space="preserve">De content die wij willen gebruiken ontbreekt (kunnen wij deze (afbeeldingen) van de opdrachtgever ontvangen?).  </w:t>
-      </w:r>
-    </w:p>
-    <w:p>
-      <w:pPr>
-        <w:spacing w:after="185" w:line="259" w:lineRule="auto"/>
-        <w:ind w:left="5" w:firstLine="0"/>
-        <w:rPr>
-          <w:b/>
-          <w:bCs/>
-        </w:rPr>
-      </w:pPr>
-      <w:r>
-        <w:t xml:space="preserve"> </w:t>
+      <w:r>
+        <w:t xml:space="preserve">Wij maken de website in de huidige </w:t>
+      </w:r>
+      <w:proofErr w:type="spellStart"/>
+      <w:r>
+        <w:t>HvanA</w:t>
+      </w:r>
+      <w:proofErr w:type="spellEnd"/>
+      <w:r>
+        <w:t xml:space="preserve">-huisstijl, waarbij we aandacht besteden aan de toegankelijkheid, </w:t>
+      </w:r>
+      <w:proofErr w:type="spellStart"/>
+      <w:r>
+        <w:t>responsiveness</w:t>
+      </w:r>
+      <w:proofErr w:type="spellEnd"/>
+      <w:r>
+        <w:t xml:space="preserve"> en performance ten opzichte van de huidige website. Wij gaan te werk met de bestaande artikelen, foto's, video's en podcasts. We maken een ontwerp waarvan op basis van onderzoek en tests aannemelijk is dat het de gebruikservaring verbetert.</w:t>
       </w:r>
     </w:p>
     <w:p>
       <w:pPr>
         <w:ind w:left="0" w:firstLine="0"/>
-        <w:rPr>
-          <w:color w:val="EE0000"/>
-        </w:rPr>
       </w:pPr>
     </w:p>
     <w:p>
@@ -738,116 +668,148 @@
     </w:p>
     <w:p>
       <w:pPr>
-        <w:spacing w:after="12"/>
-        <w:ind w:left="0"/>
-      </w:pPr>
-      <w:r>
-        <w:t xml:space="preserve">De planning bestaat uit: </w:t>
-      </w:r>
-    </w:p>
-    <w:p>
-      <w:pPr>
-        <w:spacing w:after="17"/>
-        <w:ind w:left="0"/>
+        <w:spacing w:after="186" w:line="259" w:lineRule="auto"/>
+        <w:ind w:left="5" w:firstLine="0"/>
+      </w:pPr>
+      <w:r>
+        <w:t>De planning bestaat uit:</w:t>
+      </w:r>
+    </w:p>
+    <w:p>
+      <w:pPr>
+        <w:spacing w:after="186" w:line="259" w:lineRule="auto"/>
+      </w:pPr>
+      <w:r>
+        <w:br/>
+      </w:r>
+      <w:r>
         <w:rPr>
           <w:b/>
           <w:bCs/>
-          <w:i/>
-          <w:iCs/>
-        </w:rPr>
+        </w:rPr>
+        <w:t>Week 1:</w:t>
+      </w:r>
+    </w:p>
+    <w:p>
+      <w:pPr>
+        <w:numPr>
+          <w:ilvl w:val="0"/>
+          <w:numId w:val="14"/>
+        </w:numPr>
+        <w:spacing w:after="0" w:line="259" w:lineRule="auto"/>
+      </w:pPr>
+      <w:r>
+        <w:t>Debriefing maken en opsturen naar de opdrachtgever.</w:t>
+      </w:r>
+    </w:p>
+    <w:p>
+      <w:pPr>
+        <w:numPr>
+          <w:ilvl w:val="0"/>
+          <w:numId w:val="14"/>
+        </w:numPr>
+        <w:spacing w:after="0" w:line="259" w:lineRule="auto"/>
+      </w:pPr>
+      <w:r>
+        <w:t>Schetsen maken en variaties uitwerken.</w:t>
+      </w:r>
+    </w:p>
+    <w:p>
+      <w:pPr>
+        <w:numPr>
+          <w:ilvl w:val="0"/>
+          <w:numId w:val="14"/>
+        </w:numPr>
+        <w:spacing w:after="0" w:line="259" w:lineRule="auto"/>
+      </w:pPr>
+      <w:r>
+        <w:t>Begin maken aan de website.</w:t>
+      </w:r>
+    </w:p>
+    <w:p>
+      <w:pPr>
+        <w:spacing w:after="0" w:line="259" w:lineRule="auto"/>
+        <w:ind w:left="720" w:firstLine="0"/>
+      </w:pPr>
+    </w:p>
+    <w:p>
+      <w:pPr>
+        <w:spacing w:after="186" w:line="259" w:lineRule="auto"/>
+        <w:ind w:left="5" w:firstLine="0"/>
       </w:pPr>
       <w:r>
         <w:rPr>
           <w:b/>
           <w:bCs/>
-          <w:i/>
-          <w:iCs/>
-        </w:rPr>
-        <w:t xml:space="preserve">Week 1: </w:t>
-      </w:r>
-    </w:p>
-    <w:p>
-      <w:pPr>
-        <w:spacing w:after="12"/>
-        <w:ind w:left="0"/>
-      </w:pPr>
-      <w:r>
-        <w:t xml:space="preserve">Debriefing maken en opsturen naar de opdrachtgever. </w:t>
-      </w:r>
-    </w:p>
-    <w:p>
-      <w:pPr>
-        <w:ind w:left="0" w:right="4157"/>
-      </w:pPr>
-      <w:r>
-        <w:t xml:space="preserve">Schetsen maken en variaties uitwerken. Begin maken aan de website. </w:t>
-      </w:r>
-    </w:p>
-    <w:p>
-      <w:pPr>
-        <w:spacing w:after="12"/>
-        <w:ind w:left="0"/>
+        </w:rPr>
+        <w:t>Week 2:</w:t>
+      </w:r>
+    </w:p>
+    <w:p>
+      <w:pPr>
+        <w:numPr>
+          <w:ilvl w:val="0"/>
+          <w:numId w:val="15"/>
+        </w:numPr>
+        <w:spacing w:after="0" w:line="259" w:lineRule="auto"/>
+      </w:pPr>
+      <w:r>
+        <w:t>Ontwerpen uitwerken.</w:t>
+      </w:r>
+    </w:p>
+    <w:p>
+      <w:pPr>
+        <w:numPr>
+          <w:ilvl w:val="0"/>
+          <w:numId w:val="15"/>
+        </w:numPr>
+        <w:spacing w:after="0" w:line="259" w:lineRule="auto"/>
+      </w:pPr>
+      <w:r>
+        <w:t>Feedback vragen aan elkaar (code review).</w:t>
+      </w:r>
+    </w:p>
+    <w:p>
+      <w:pPr>
+        <w:spacing w:after="0" w:line="259" w:lineRule="auto"/>
+        <w:ind w:left="360" w:firstLine="0"/>
+      </w:pPr>
+    </w:p>
+    <w:p>
+      <w:pPr>
+        <w:spacing w:after="186" w:line="259" w:lineRule="auto"/>
+        <w:ind w:left="5" w:firstLine="0"/>
+      </w:pPr>
+      <w:r>
         <w:rPr>
           <w:b/>
           <w:bCs/>
-          <w:i/>
-          <w:iCs/>
-        </w:rPr>
-      </w:pPr>
-      <w:r>
-        <w:rPr>
-          <w:b/>
-          <w:bCs/>
-          <w:i/>
-          <w:iCs/>
-        </w:rPr>
-        <w:t xml:space="preserve">Week 2: </w:t>
-      </w:r>
-    </w:p>
-    <w:p>
-      <w:pPr>
-        <w:spacing w:after="12"/>
-        <w:ind w:left="0"/>
-      </w:pPr>
-      <w:r>
-        <w:t xml:space="preserve">Ontwerpen uitwerken. </w:t>
-      </w:r>
-    </w:p>
-    <w:p>
-      <w:pPr>
-        <w:ind w:left="0"/>
-      </w:pPr>
-      <w:r>
-        <w:t xml:space="preserve">Feedback vragen aan elkaar (code review). </w:t>
-      </w:r>
-    </w:p>
-    <w:p>
-      <w:pPr>
-        <w:spacing w:after="12"/>
-        <w:ind w:left="0"/>
-        <w:rPr>
-          <w:b/>
-          <w:bCs/>
-          <w:i/>
-          <w:iCs/>
-        </w:rPr>
-      </w:pPr>
-      <w:r>
-        <w:rPr>
-          <w:b/>
-          <w:bCs/>
-          <w:i/>
-          <w:iCs/>
-        </w:rPr>
-        <w:t xml:space="preserve">Week 3: </w:t>
-      </w:r>
-    </w:p>
-    <w:p>
-      <w:pPr>
-        <w:ind w:left="0" w:right="5387"/>
-      </w:pPr>
-      <w:r>
-        <w:t xml:space="preserve">Sprint review voorbereiden. Sprint review. </w:t>
+        </w:rPr>
+        <w:t>Week 3:</w:t>
+      </w:r>
+    </w:p>
+    <w:p>
+      <w:pPr>
+        <w:numPr>
+          <w:ilvl w:val="0"/>
+          <w:numId w:val="16"/>
+        </w:numPr>
+        <w:spacing w:after="0" w:line="259" w:lineRule="auto"/>
+      </w:pPr>
+      <w:r>
+        <w:t>Sprint review voorbereiden.</w:t>
+      </w:r>
+    </w:p>
+    <w:p>
+      <w:pPr>
+        <w:numPr>
+          <w:ilvl w:val="0"/>
+          <w:numId w:val="16"/>
+        </w:numPr>
+        <w:spacing w:after="0" w:line="259" w:lineRule="auto"/>
+      </w:pPr>
+      <w:r>
+        <w:t>Sprint review.</w:t>
       </w:r>
     </w:p>
     <w:p>
@@ -855,9 +817,18 @@
         <w:spacing w:after="186" w:line="259" w:lineRule="auto"/>
         <w:ind w:left="5" w:firstLine="0"/>
       </w:pPr>
-      <w:r>
-        <w:t xml:space="preserve"> </w:t>
-      </w:r>
+    </w:p>
+    <w:p>
+      <w:pPr>
+        <w:spacing w:after="186" w:line="259" w:lineRule="auto"/>
+        <w:ind w:left="5" w:firstLine="0"/>
+      </w:pPr>
+    </w:p>
+    <w:p>
+      <w:pPr>
+        <w:spacing w:after="186" w:line="259" w:lineRule="auto"/>
+        <w:ind w:left="5" w:firstLine="0"/>
+      </w:pPr>
     </w:p>
     <w:p>
       <w:pPr>
@@ -876,46 +847,59 @@
           <w:b/>
           <w:bCs/>
         </w:rPr>
+        <w:lastRenderedPageBreak/>
         <w:t xml:space="preserve">Gebruikers </w:t>
       </w:r>
     </w:p>
     <w:p>
       <w:pPr>
-        <w:spacing w:after="2618"/>
-        <w:ind w:left="5" w:firstLine="0"/>
-        <w:rPr>
-          <w:color w:val="auto"/>
-        </w:rPr>
-      </w:pPr>
-      <w:r>
-        <w:rPr>
-          <w:color w:val="auto"/>
-        </w:rPr>
-        <w:t>Voor HvanA zijn primair studenten en medewerkers van de H</w:t>
-      </w:r>
-      <w:r>
-        <w:rPr>
-          <w:color w:val="auto"/>
-        </w:rPr>
-        <w:t>v</w:t>
-      </w:r>
-      <w:r>
-        <w:rPr>
-          <w:color w:val="auto"/>
-        </w:rPr>
-        <w:t>A de doelgroepen. Onderwijskundigen zijn een deel van die tweede gr</w:t>
-      </w:r>
-      <w:r>
-        <w:rPr>
-          <w:color w:val="auto"/>
-        </w:rPr>
-        <w:t xml:space="preserve">oep. </w:t>
-      </w:r>
-      <w:r>
-        <w:rPr>
-          <w:color w:val="auto"/>
-        </w:rPr>
-        <w:t xml:space="preserve">Graag voor telefoongebruikers toegankelijker maken.  </w:t>
+        <w:pStyle w:val="Normaalweb"/>
+        <w:shd w:val="clear" w:color="auto" w:fill="FFFFFF"/>
+        <w:spacing w:before="0" w:beforeAutospacing="0" w:after="0" w:afterAutospacing="0"/>
+        <w:ind w:left="365"/>
+        <w:rPr>
+          <w:rFonts w:ascii="Calibri" w:hAnsi="Calibri" w:cs="Calibri"/>
+          <w:color w:val="1F2328"/>
+        </w:rPr>
+      </w:pPr>
+      <w:r>
+        <w:rPr>
+          <w:rFonts w:ascii="Calibri" w:hAnsi="Calibri" w:cs="Calibri"/>
+          <w:color w:val="1F2328"/>
+        </w:rPr>
+        <w:t xml:space="preserve">Voor </w:t>
+      </w:r>
+      <w:proofErr w:type="spellStart"/>
+      <w:r>
+        <w:rPr>
+          <w:rFonts w:ascii="Calibri" w:hAnsi="Calibri" w:cs="Calibri"/>
+          <w:color w:val="1F2328"/>
+        </w:rPr>
+        <w:t>HvanA</w:t>
+      </w:r>
+      <w:proofErr w:type="spellEnd"/>
+      <w:r>
+        <w:rPr>
+          <w:rFonts w:ascii="Calibri" w:hAnsi="Calibri" w:cs="Calibri"/>
+          <w:color w:val="1F2328"/>
+        </w:rPr>
+        <w:t xml:space="preserve"> zijn primair studenten en medewerker van de </w:t>
+      </w:r>
+      <w:proofErr w:type="spellStart"/>
+      <w:r>
+        <w:rPr>
+          <w:rFonts w:ascii="Calibri" w:hAnsi="Calibri" w:cs="Calibri"/>
+          <w:color w:val="1F2328"/>
+        </w:rPr>
+        <w:t>HvA</w:t>
+      </w:r>
+      <w:proofErr w:type="spellEnd"/>
+      <w:r>
+        <w:rPr>
+          <w:rFonts w:ascii="Calibri" w:hAnsi="Calibri" w:cs="Calibri"/>
+          <w:color w:val="1F2328"/>
+        </w:rPr>
+        <w:t xml:space="preserve"> de doelgroepen. Onderwijskundige zijn een deel van die tweede groep. Graag voor telefoongebruikers toegankelijker maken.</w:t>
       </w:r>
     </w:p>
     <w:p>
@@ -923,15 +907,6 @@
         <w:spacing w:after="2618"/>
         <w:ind w:left="0"/>
       </w:pPr>
-      <w:r>
-        <w:t> </w:t>
-      </w:r>
-    </w:p>
-    <w:p>
-      <w:pPr>
-        <w:spacing w:after="2618"/>
-        <w:ind w:left="0"/>
-      </w:pPr>
     </w:p>
     <w:p>
       <w:pPr>
@@ -939,7 +914,6 @@
         <w:ind w:left="0" w:firstLine="0"/>
       </w:pPr>
       <w:r>
-        <w:lastRenderedPageBreak/>
         <w:t xml:space="preserve"> </w:t>
       </w:r>
       <w:r>
@@ -968,6 +942,155 @@
 <file path=word/numbering.xml><?xml version="1.0" encoding="utf-8"?>
 <w:numbering xmlns:wpc="http://schemas.microsoft.com/office/word/2010/wordprocessingCanvas" xmlns:cx="http://schemas.microsoft.com/office/drawing/2014/chartex" xmlns:cx1="http://schemas.microsoft.com/office/drawing/2015/9/8/chartex" xmlns:cx2="http://schemas.microsoft.com/office/drawing/2015/10/21/chartex" xmlns:cx3="http://schemas.microsoft.com/office/drawing/2016/5/9/chartex" xmlns:cx4="http://schemas.microsoft.com/office/drawing/2016/5/10/chartex" xmlns:cx5="http://schemas.microsoft.com/office/drawing/2016/5/11/chartex" xmlns:cx6="http://schemas.microsoft.com/office/drawing/2016/5/12/chartex" xmlns:cx7="http://schemas.microsoft.com/office/drawing/2016/5/13/chartex" xmlns:cx8="http://schemas.microsoft.com/office/drawing/2016/5/14/chartex" xmlns:mc="http://schemas.openxmlformats.org/markup-compatibility/2006" xmlns:aink="http://schemas.microsoft.com/office/drawing/2016/ink" xmlns:am3d="http://schemas.microsoft.com/office/drawing/2017/model3d" xmlns:o="urn:schemas-microsoft-com:office:office" xmlns:oel="http://schemas.microsoft.com/office/2019/extlst" xmlns:r="http://schemas.openxmlformats.org/officeDocument/2006/relationships" xmlns:m="http://schemas.openxmlformats.org/officeDocument/2006/math" xmlns:v="urn:schemas-microsoft-com:vml" xmlns:wp14="http://schemas.microsoft.com/office/word/2010/wordprocessingDrawing" xmlns:wp="http://schemas.openxmlformats.org/drawingml/2006/wordprocessingDrawing" xmlns:w10="urn:schemas-microsoft-com:office:word" xmlns:w="http://schemas.openxmlformats.org/wordprocessingml/2006/main" xmlns:w14="http://schemas.microsoft.com/office/word/2010/wordml" xmlns:w15="http://schemas.microsoft.com/office/word/2012/wordml" xmlns:w16cex="http://schemas.microsoft.com/office/word/2018/wordml/cex" xmlns:w16cid="http://schemas.microsoft.com/office/word/2016/wordml/cid" xmlns:w16="http://schemas.microsoft.com/office/word/2018/wordml" xmlns:w16du="http://schemas.microsoft.com/office/word/2023/wordml/word16du" xmlns:w16sdtdh="http://schemas.microsoft.com/office/word/2020/wordml/sdtdatahash" xmlns:w16sdtfl="http://schemas.microsoft.com/office/word/2024/wordml/sdtformatlock" xmlns:w16se="http://schemas.microsoft.com/office/word/2015/wordml/symex" xmlns:wpg="http://schemas.microsoft.com/office/word/2010/wordprocessingGroup" xmlns:wpi="http://schemas.microsoft.com/office/word/2010/wordprocessingInk" xmlns:wne="http://schemas.microsoft.com/office/word/2006/wordml" xmlns:wps="http://schemas.microsoft.com/office/word/2010/wordprocessingShape" mc:Ignorable="w14 w15 w16se w16cid w16 w16cex w16sdtdh w16sdtfl w16du wp14">
   <w:abstractNum w:abstractNumId="0" w15:restartNumberingAfterBreak="0">
+    <w:nsid w:val="1BBA744D"/>
+    <w:multiLevelType w:val="multilevel"/>
+    <w:tmpl w:val="E572FA16"/>
+    <w:lvl w:ilvl="0">
+      <w:start w:val="1"/>
+      <w:numFmt w:val="bullet"/>
+      <w:lvlText w:val=""/>
+      <w:lvlJc w:val="left"/>
+      <w:pPr>
+        <w:tabs>
+          <w:tab w:val="num" w:pos="720"/>
+        </w:tabs>
+        <w:ind w:left="720" w:hanging="360"/>
+      </w:pPr>
+      <w:rPr>
+        <w:rFonts w:ascii="Symbol" w:hAnsi="Symbol" w:hint="default"/>
+        <w:sz w:val="20"/>
+      </w:rPr>
+    </w:lvl>
+    <w:lvl w:ilvl="1" w:tentative="1">
+      <w:start w:val="1"/>
+      <w:numFmt w:val="bullet"/>
+      <w:lvlText w:val="o"/>
+      <w:lvlJc w:val="left"/>
+      <w:pPr>
+        <w:tabs>
+          <w:tab w:val="num" w:pos="1440"/>
+        </w:tabs>
+        <w:ind w:left="1440" w:hanging="360"/>
+      </w:pPr>
+      <w:rPr>
+        <w:rFonts w:ascii="Courier New" w:hAnsi="Courier New" w:hint="default"/>
+        <w:sz w:val="20"/>
+      </w:rPr>
+    </w:lvl>
+    <w:lvl w:ilvl="2" w:tentative="1">
+      <w:start w:val="1"/>
+      <w:numFmt w:val="bullet"/>
+      <w:lvlText w:val=""/>
+      <w:lvlJc w:val="left"/>
+      <w:pPr>
+        <w:tabs>
+          <w:tab w:val="num" w:pos="2160"/>
+        </w:tabs>
+        <w:ind w:left="2160" w:hanging="360"/>
+      </w:pPr>
+      <w:rPr>
+        <w:rFonts w:ascii="Wingdings" w:hAnsi="Wingdings" w:hint="default"/>
+        <w:sz w:val="20"/>
+      </w:rPr>
+    </w:lvl>
+    <w:lvl w:ilvl="3" w:tentative="1">
+      <w:start w:val="1"/>
+      <w:numFmt w:val="bullet"/>
+      <w:lvlText w:val=""/>
+      <w:lvlJc w:val="left"/>
+      <w:pPr>
+        <w:tabs>
+          <w:tab w:val="num" w:pos="2880"/>
+        </w:tabs>
+        <w:ind w:left="2880" w:hanging="360"/>
+      </w:pPr>
+      <w:rPr>
+        <w:rFonts w:ascii="Wingdings" w:hAnsi="Wingdings" w:hint="default"/>
+        <w:sz w:val="20"/>
+      </w:rPr>
+    </w:lvl>
+    <w:lvl w:ilvl="4" w:tentative="1">
+      <w:start w:val="1"/>
+      <w:numFmt w:val="bullet"/>
+      <w:lvlText w:val=""/>
+      <w:lvlJc w:val="left"/>
+      <w:pPr>
+        <w:tabs>
+          <w:tab w:val="num" w:pos="3600"/>
+        </w:tabs>
+        <w:ind w:left="3600" w:hanging="360"/>
+      </w:pPr>
+      <w:rPr>
+        <w:rFonts w:ascii="Wingdings" w:hAnsi="Wingdings" w:hint="default"/>
+        <w:sz w:val="20"/>
+      </w:rPr>
+    </w:lvl>
+    <w:lvl w:ilvl="5" w:tentative="1">
+      <w:start w:val="1"/>
+      <w:numFmt w:val="bullet"/>
+      <w:lvlText w:val=""/>
+      <w:lvlJc w:val="left"/>
+      <w:pPr>
+        <w:tabs>
+          <w:tab w:val="num" w:pos="4320"/>
+        </w:tabs>
+        <w:ind w:left="4320" w:hanging="360"/>
+      </w:pPr>
+      <w:rPr>
+        <w:rFonts w:ascii="Wingdings" w:hAnsi="Wingdings" w:hint="default"/>
+        <w:sz w:val="20"/>
+      </w:rPr>
+    </w:lvl>
+    <w:lvl w:ilvl="6" w:tentative="1">
+      <w:start w:val="1"/>
+      <w:numFmt w:val="bullet"/>
+      <w:lvlText w:val=""/>
+      <w:lvlJc w:val="left"/>
+      <w:pPr>
+        <w:tabs>
+          <w:tab w:val="num" w:pos="5040"/>
+        </w:tabs>
+        <w:ind w:left="5040" w:hanging="360"/>
+      </w:pPr>
+      <w:rPr>
+        <w:rFonts w:ascii="Wingdings" w:hAnsi="Wingdings" w:hint="default"/>
+        <w:sz w:val="20"/>
+      </w:rPr>
+    </w:lvl>
+    <w:lvl w:ilvl="7" w:tentative="1">
+      <w:start w:val="1"/>
+      <w:numFmt w:val="bullet"/>
+      <w:lvlText w:val=""/>
+      <w:lvlJc w:val="left"/>
+      <w:pPr>
+        <w:tabs>
+          <w:tab w:val="num" w:pos="5760"/>
+        </w:tabs>
+        <w:ind w:left="5760" w:hanging="360"/>
+      </w:pPr>
+      <w:rPr>
+        <w:rFonts w:ascii="Wingdings" w:hAnsi="Wingdings" w:hint="default"/>
+        <w:sz w:val="20"/>
+      </w:rPr>
+    </w:lvl>
+    <w:lvl w:ilvl="8" w:tentative="1">
+      <w:start w:val="1"/>
+      <w:numFmt w:val="bullet"/>
+      <w:lvlText w:val=""/>
+      <w:lvlJc w:val="left"/>
+      <w:pPr>
+        <w:tabs>
+          <w:tab w:val="num" w:pos="6480"/>
+        </w:tabs>
+        <w:ind w:left="6480" w:hanging="360"/>
+      </w:pPr>
+      <w:rPr>
+        <w:rFonts w:ascii="Wingdings" w:hAnsi="Wingdings" w:hint="default"/>
+        <w:sz w:val="20"/>
+      </w:rPr>
+    </w:lvl>
+  </w:abstractNum>
+  <w:abstractNum w:abstractNumId="1" w15:restartNumberingAfterBreak="0">
     <w:nsid w:val="255C6249"/>
     <w:multiLevelType w:val="multilevel"/>
     <w:tmpl w:val="BEB4B20A"/>
@@ -1116,7 +1239,7 @@
       </w:rPr>
     </w:lvl>
   </w:abstractNum>
-  <w:abstractNum w:abstractNumId="1" w15:restartNumberingAfterBreak="0">
+  <w:abstractNum w:abstractNumId="2" w15:restartNumberingAfterBreak="0">
     <w:nsid w:val="25DC224F"/>
     <w:multiLevelType w:val="multilevel"/>
     <w:tmpl w:val="BD96B3D6"/>
@@ -1265,7 +1388,7 @@
       </w:rPr>
     </w:lvl>
   </w:abstractNum>
-  <w:abstractNum w:abstractNumId="2" w15:restartNumberingAfterBreak="0">
+  <w:abstractNum w:abstractNumId="3" w15:restartNumberingAfterBreak="0">
     <w:nsid w:val="27756FF9"/>
     <w:multiLevelType w:val="hybridMultilevel"/>
     <w:tmpl w:val="E24E48E2"/>
@@ -1477,7 +1600,156 @@
       </w:rPr>
     </w:lvl>
   </w:abstractNum>
-  <w:abstractNum w:abstractNumId="3" w15:restartNumberingAfterBreak="0">
+  <w:abstractNum w:abstractNumId="4" w15:restartNumberingAfterBreak="0">
+    <w:nsid w:val="2EEE1A80"/>
+    <w:multiLevelType w:val="multilevel"/>
+    <w:tmpl w:val="A2A4EB98"/>
+    <w:lvl w:ilvl="0">
+      <w:start w:val="1"/>
+      <w:numFmt w:val="bullet"/>
+      <w:lvlText w:val=""/>
+      <w:lvlJc w:val="left"/>
+      <w:pPr>
+        <w:tabs>
+          <w:tab w:val="num" w:pos="720"/>
+        </w:tabs>
+        <w:ind w:left="720" w:hanging="360"/>
+      </w:pPr>
+      <w:rPr>
+        <w:rFonts w:ascii="Symbol" w:hAnsi="Symbol" w:hint="default"/>
+        <w:sz w:val="20"/>
+      </w:rPr>
+    </w:lvl>
+    <w:lvl w:ilvl="1" w:tentative="1">
+      <w:start w:val="1"/>
+      <w:numFmt w:val="bullet"/>
+      <w:lvlText w:val="o"/>
+      <w:lvlJc w:val="left"/>
+      <w:pPr>
+        <w:tabs>
+          <w:tab w:val="num" w:pos="1440"/>
+        </w:tabs>
+        <w:ind w:left="1440" w:hanging="360"/>
+      </w:pPr>
+      <w:rPr>
+        <w:rFonts w:ascii="Courier New" w:hAnsi="Courier New" w:hint="default"/>
+        <w:sz w:val="20"/>
+      </w:rPr>
+    </w:lvl>
+    <w:lvl w:ilvl="2" w:tentative="1">
+      <w:start w:val="1"/>
+      <w:numFmt w:val="bullet"/>
+      <w:lvlText w:val=""/>
+      <w:lvlJc w:val="left"/>
+      <w:pPr>
+        <w:tabs>
+          <w:tab w:val="num" w:pos="2160"/>
+        </w:tabs>
+        <w:ind w:left="2160" w:hanging="360"/>
+      </w:pPr>
+      <w:rPr>
+        <w:rFonts w:ascii="Wingdings" w:hAnsi="Wingdings" w:hint="default"/>
+        <w:sz w:val="20"/>
+      </w:rPr>
+    </w:lvl>
+    <w:lvl w:ilvl="3" w:tentative="1">
+      <w:start w:val="1"/>
+      <w:numFmt w:val="bullet"/>
+      <w:lvlText w:val=""/>
+      <w:lvlJc w:val="left"/>
+      <w:pPr>
+        <w:tabs>
+          <w:tab w:val="num" w:pos="2880"/>
+        </w:tabs>
+        <w:ind w:left="2880" w:hanging="360"/>
+      </w:pPr>
+      <w:rPr>
+        <w:rFonts w:ascii="Wingdings" w:hAnsi="Wingdings" w:hint="default"/>
+        <w:sz w:val="20"/>
+      </w:rPr>
+    </w:lvl>
+    <w:lvl w:ilvl="4" w:tentative="1">
+      <w:start w:val="1"/>
+      <w:numFmt w:val="bullet"/>
+      <w:lvlText w:val=""/>
+      <w:lvlJc w:val="left"/>
+      <w:pPr>
+        <w:tabs>
+          <w:tab w:val="num" w:pos="3600"/>
+        </w:tabs>
+        <w:ind w:left="3600" w:hanging="360"/>
+      </w:pPr>
+      <w:rPr>
+        <w:rFonts w:ascii="Wingdings" w:hAnsi="Wingdings" w:hint="default"/>
+        <w:sz w:val="20"/>
+      </w:rPr>
+    </w:lvl>
+    <w:lvl w:ilvl="5" w:tentative="1">
+      <w:start w:val="1"/>
+      <w:numFmt w:val="bullet"/>
+      <w:lvlText w:val=""/>
+      <w:lvlJc w:val="left"/>
+      <w:pPr>
+        <w:tabs>
+          <w:tab w:val="num" w:pos="4320"/>
+        </w:tabs>
+        <w:ind w:left="4320" w:hanging="360"/>
+      </w:pPr>
+      <w:rPr>
+        <w:rFonts w:ascii="Wingdings" w:hAnsi="Wingdings" w:hint="default"/>
+        <w:sz w:val="20"/>
+      </w:rPr>
+    </w:lvl>
+    <w:lvl w:ilvl="6" w:tentative="1">
+      <w:start w:val="1"/>
+      <w:numFmt w:val="bullet"/>
+      <w:lvlText w:val=""/>
+      <w:lvlJc w:val="left"/>
+      <w:pPr>
+        <w:tabs>
+          <w:tab w:val="num" w:pos="5040"/>
+        </w:tabs>
+        <w:ind w:left="5040" w:hanging="360"/>
+      </w:pPr>
+      <w:rPr>
+        <w:rFonts w:ascii="Wingdings" w:hAnsi="Wingdings" w:hint="default"/>
+        <w:sz w:val="20"/>
+      </w:rPr>
+    </w:lvl>
+    <w:lvl w:ilvl="7" w:tentative="1">
+      <w:start w:val="1"/>
+      <w:numFmt w:val="bullet"/>
+      <w:lvlText w:val=""/>
+      <w:lvlJc w:val="left"/>
+      <w:pPr>
+        <w:tabs>
+          <w:tab w:val="num" w:pos="5760"/>
+        </w:tabs>
+        <w:ind w:left="5760" w:hanging="360"/>
+      </w:pPr>
+      <w:rPr>
+        <w:rFonts w:ascii="Wingdings" w:hAnsi="Wingdings" w:hint="default"/>
+        <w:sz w:val="20"/>
+      </w:rPr>
+    </w:lvl>
+    <w:lvl w:ilvl="8" w:tentative="1">
+      <w:start w:val="1"/>
+      <w:numFmt w:val="bullet"/>
+      <w:lvlText w:val=""/>
+      <w:lvlJc w:val="left"/>
+      <w:pPr>
+        <w:tabs>
+          <w:tab w:val="num" w:pos="6480"/>
+        </w:tabs>
+        <w:ind w:left="6480" w:hanging="360"/>
+      </w:pPr>
+      <w:rPr>
+        <w:rFonts w:ascii="Wingdings" w:hAnsi="Wingdings" w:hint="default"/>
+        <w:sz w:val="20"/>
+      </w:rPr>
+    </w:lvl>
+  </w:abstractNum>
+  <w:abstractNum w:abstractNumId="5" w15:restartNumberingAfterBreak="0">
     <w:nsid w:val="3D0105B5"/>
     <w:multiLevelType w:val="hybridMultilevel"/>
     <w:tmpl w:val="02CED770"/>
@@ -1566,7 +1838,7 @@
       </w:pPr>
     </w:lvl>
   </w:abstractNum>
-  <w:abstractNum w:abstractNumId="4" w15:restartNumberingAfterBreak="0">
+  <w:abstractNum w:abstractNumId="6" w15:restartNumberingAfterBreak="0">
     <w:nsid w:val="41226E0C"/>
     <w:multiLevelType w:val="multilevel"/>
     <w:tmpl w:val="15E443F4"/>
@@ -1715,7 +1987,7 @@
       </w:rPr>
     </w:lvl>
   </w:abstractNum>
-  <w:abstractNum w:abstractNumId="5" w15:restartNumberingAfterBreak="0">
+  <w:abstractNum w:abstractNumId="7" w15:restartNumberingAfterBreak="0">
     <w:nsid w:val="501A3791"/>
     <w:multiLevelType w:val="hybridMultilevel"/>
     <w:tmpl w:val="F6DAB536"/>
@@ -1927,7 +2199,7 @@
       </w:rPr>
     </w:lvl>
   </w:abstractNum>
-  <w:abstractNum w:abstractNumId="6" w15:restartNumberingAfterBreak="0">
+  <w:abstractNum w:abstractNumId="8" w15:restartNumberingAfterBreak="0">
     <w:nsid w:val="5DEC7FC7"/>
     <w:multiLevelType w:val="hybridMultilevel"/>
     <w:tmpl w:val="52B45878"/>
@@ -2041,7 +2313,7 @@
       </w:rPr>
     </w:lvl>
   </w:abstractNum>
-  <w:abstractNum w:abstractNumId="7" w15:restartNumberingAfterBreak="0">
+  <w:abstractNum w:abstractNumId="9" w15:restartNumberingAfterBreak="0">
     <w:nsid w:val="5E1A4CA4"/>
     <w:multiLevelType w:val="multilevel"/>
     <w:tmpl w:val="CB4A4998"/>
@@ -2190,7 +2462,156 @@
       </w:rPr>
     </w:lvl>
   </w:abstractNum>
-  <w:abstractNum w:abstractNumId="8" w15:restartNumberingAfterBreak="0">
+  <w:abstractNum w:abstractNumId="10" w15:restartNumberingAfterBreak="0">
+    <w:nsid w:val="620942D7"/>
+    <w:multiLevelType w:val="multilevel"/>
+    <w:tmpl w:val="F6CEC194"/>
+    <w:lvl w:ilvl="0">
+      <w:start w:val="1"/>
+      <w:numFmt w:val="bullet"/>
+      <w:lvlText w:val=""/>
+      <w:lvlJc w:val="left"/>
+      <w:pPr>
+        <w:tabs>
+          <w:tab w:val="num" w:pos="720"/>
+        </w:tabs>
+        <w:ind w:left="720" w:hanging="360"/>
+      </w:pPr>
+      <w:rPr>
+        <w:rFonts w:ascii="Symbol" w:hAnsi="Symbol" w:hint="default"/>
+        <w:sz w:val="20"/>
+      </w:rPr>
+    </w:lvl>
+    <w:lvl w:ilvl="1" w:tentative="1">
+      <w:start w:val="1"/>
+      <w:numFmt w:val="bullet"/>
+      <w:lvlText w:val="o"/>
+      <w:lvlJc w:val="left"/>
+      <w:pPr>
+        <w:tabs>
+          <w:tab w:val="num" w:pos="1440"/>
+        </w:tabs>
+        <w:ind w:left="1440" w:hanging="360"/>
+      </w:pPr>
+      <w:rPr>
+        <w:rFonts w:ascii="Courier New" w:hAnsi="Courier New" w:hint="default"/>
+        <w:sz w:val="20"/>
+      </w:rPr>
+    </w:lvl>
+    <w:lvl w:ilvl="2" w:tentative="1">
+      <w:start w:val="1"/>
+      <w:numFmt w:val="bullet"/>
+      <w:lvlText w:val=""/>
+      <w:lvlJc w:val="left"/>
+      <w:pPr>
+        <w:tabs>
+          <w:tab w:val="num" w:pos="2160"/>
+        </w:tabs>
+        <w:ind w:left="2160" w:hanging="360"/>
+      </w:pPr>
+      <w:rPr>
+        <w:rFonts w:ascii="Wingdings" w:hAnsi="Wingdings" w:hint="default"/>
+        <w:sz w:val="20"/>
+      </w:rPr>
+    </w:lvl>
+    <w:lvl w:ilvl="3" w:tentative="1">
+      <w:start w:val="1"/>
+      <w:numFmt w:val="bullet"/>
+      <w:lvlText w:val=""/>
+      <w:lvlJc w:val="left"/>
+      <w:pPr>
+        <w:tabs>
+          <w:tab w:val="num" w:pos="2880"/>
+        </w:tabs>
+        <w:ind w:left="2880" w:hanging="360"/>
+      </w:pPr>
+      <w:rPr>
+        <w:rFonts w:ascii="Wingdings" w:hAnsi="Wingdings" w:hint="default"/>
+        <w:sz w:val="20"/>
+      </w:rPr>
+    </w:lvl>
+    <w:lvl w:ilvl="4" w:tentative="1">
+      <w:start w:val="1"/>
+      <w:numFmt w:val="bullet"/>
+      <w:lvlText w:val=""/>
+      <w:lvlJc w:val="left"/>
+      <w:pPr>
+        <w:tabs>
+          <w:tab w:val="num" w:pos="3600"/>
+        </w:tabs>
+        <w:ind w:left="3600" w:hanging="360"/>
+      </w:pPr>
+      <w:rPr>
+        <w:rFonts w:ascii="Wingdings" w:hAnsi="Wingdings" w:hint="default"/>
+        <w:sz w:val="20"/>
+      </w:rPr>
+    </w:lvl>
+    <w:lvl w:ilvl="5" w:tentative="1">
+      <w:start w:val="1"/>
+      <w:numFmt w:val="bullet"/>
+      <w:lvlText w:val=""/>
+      <w:lvlJc w:val="left"/>
+      <w:pPr>
+        <w:tabs>
+          <w:tab w:val="num" w:pos="4320"/>
+        </w:tabs>
+        <w:ind w:left="4320" w:hanging="360"/>
+      </w:pPr>
+      <w:rPr>
+        <w:rFonts w:ascii="Wingdings" w:hAnsi="Wingdings" w:hint="default"/>
+        <w:sz w:val="20"/>
+      </w:rPr>
+    </w:lvl>
+    <w:lvl w:ilvl="6" w:tentative="1">
+      <w:start w:val="1"/>
+      <w:numFmt w:val="bullet"/>
+      <w:lvlText w:val=""/>
+      <w:lvlJc w:val="left"/>
+      <w:pPr>
+        <w:tabs>
+          <w:tab w:val="num" w:pos="5040"/>
+        </w:tabs>
+        <w:ind w:left="5040" w:hanging="360"/>
+      </w:pPr>
+      <w:rPr>
+        <w:rFonts w:ascii="Wingdings" w:hAnsi="Wingdings" w:hint="default"/>
+        <w:sz w:val="20"/>
+      </w:rPr>
+    </w:lvl>
+    <w:lvl w:ilvl="7" w:tentative="1">
+      <w:start w:val="1"/>
+      <w:numFmt w:val="bullet"/>
+      <w:lvlText w:val=""/>
+      <w:lvlJc w:val="left"/>
+      <w:pPr>
+        <w:tabs>
+          <w:tab w:val="num" w:pos="5760"/>
+        </w:tabs>
+        <w:ind w:left="5760" w:hanging="360"/>
+      </w:pPr>
+      <w:rPr>
+        <w:rFonts w:ascii="Wingdings" w:hAnsi="Wingdings" w:hint="default"/>
+        <w:sz w:val="20"/>
+      </w:rPr>
+    </w:lvl>
+    <w:lvl w:ilvl="8" w:tentative="1">
+      <w:start w:val="1"/>
+      <w:numFmt w:val="bullet"/>
+      <w:lvlText w:val=""/>
+      <w:lvlJc w:val="left"/>
+      <w:pPr>
+        <w:tabs>
+          <w:tab w:val="num" w:pos="6480"/>
+        </w:tabs>
+        <w:ind w:left="6480" w:hanging="360"/>
+      </w:pPr>
+      <w:rPr>
+        <w:rFonts w:ascii="Wingdings" w:hAnsi="Wingdings" w:hint="default"/>
+        <w:sz w:val="20"/>
+      </w:rPr>
+    </w:lvl>
+  </w:abstractNum>
+  <w:abstractNum w:abstractNumId="11" w15:restartNumberingAfterBreak="0">
     <w:nsid w:val="65180A7C"/>
     <w:multiLevelType w:val="multilevel"/>
     <w:tmpl w:val="E2323678"/>
@@ -2339,7 +2760,156 @@
       </w:rPr>
     </w:lvl>
   </w:abstractNum>
-  <w:abstractNum w:abstractNumId="9" w15:restartNumberingAfterBreak="0">
+  <w:abstractNum w:abstractNumId="12" w15:restartNumberingAfterBreak="0">
+    <w:nsid w:val="654129C7"/>
+    <w:multiLevelType w:val="multilevel"/>
+    <w:tmpl w:val="02945E8E"/>
+    <w:lvl w:ilvl="0">
+      <w:start w:val="1"/>
+      <w:numFmt w:val="bullet"/>
+      <w:lvlText w:val=""/>
+      <w:lvlJc w:val="left"/>
+      <w:pPr>
+        <w:tabs>
+          <w:tab w:val="num" w:pos="720"/>
+        </w:tabs>
+        <w:ind w:left="720" w:hanging="360"/>
+      </w:pPr>
+      <w:rPr>
+        <w:rFonts w:ascii="Symbol" w:hAnsi="Symbol" w:hint="default"/>
+        <w:sz w:val="20"/>
+      </w:rPr>
+    </w:lvl>
+    <w:lvl w:ilvl="1" w:tentative="1">
+      <w:start w:val="1"/>
+      <w:numFmt w:val="bullet"/>
+      <w:lvlText w:val="o"/>
+      <w:lvlJc w:val="left"/>
+      <w:pPr>
+        <w:tabs>
+          <w:tab w:val="num" w:pos="1440"/>
+        </w:tabs>
+        <w:ind w:left="1440" w:hanging="360"/>
+      </w:pPr>
+      <w:rPr>
+        <w:rFonts w:ascii="Courier New" w:hAnsi="Courier New" w:hint="default"/>
+        <w:sz w:val="20"/>
+      </w:rPr>
+    </w:lvl>
+    <w:lvl w:ilvl="2" w:tentative="1">
+      <w:start w:val="1"/>
+      <w:numFmt w:val="bullet"/>
+      <w:lvlText w:val=""/>
+      <w:lvlJc w:val="left"/>
+      <w:pPr>
+        <w:tabs>
+          <w:tab w:val="num" w:pos="2160"/>
+        </w:tabs>
+        <w:ind w:left="2160" w:hanging="360"/>
+      </w:pPr>
+      <w:rPr>
+        <w:rFonts w:ascii="Wingdings" w:hAnsi="Wingdings" w:hint="default"/>
+        <w:sz w:val="20"/>
+      </w:rPr>
+    </w:lvl>
+    <w:lvl w:ilvl="3" w:tentative="1">
+      <w:start w:val="1"/>
+      <w:numFmt w:val="bullet"/>
+      <w:lvlText w:val=""/>
+      <w:lvlJc w:val="left"/>
+      <w:pPr>
+        <w:tabs>
+          <w:tab w:val="num" w:pos="2880"/>
+        </w:tabs>
+        <w:ind w:left="2880" w:hanging="360"/>
+      </w:pPr>
+      <w:rPr>
+        <w:rFonts w:ascii="Wingdings" w:hAnsi="Wingdings" w:hint="default"/>
+        <w:sz w:val="20"/>
+      </w:rPr>
+    </w:lvl>
+    <w:lvl w:ilvl="4" w:tentative="1">
+      <w:start w:val="1"/>
+      <w:numFmt w:val="bullet"/>
+      <w:lvlText w:val=""/>
+      <w:lvlJc w:val="left"/>
+      <w:pPr>
+        <w:tabs>
+          <w:tab w:val="num" w:pos="3600"/>
+        </w:tabs>
+        <w:ind w:left="3600" w:hanging="360"/>
+      </w:pPr>
+      <w:rPr>
+        <w:rFonts w:ascii="Wingdings" w:hAnsi="Wingdings" w:hint="default"/>
+        <w:sz w:val="20"/>
+      </w:rPr>
+    </w:lvl>
+    <w:lvl w:ilvl="5" w:tentative="1">
+      <w:start w:val="1"/>
+      <w:numFmt w:val="bullet"/>
+      <w:lvlText w:val=""/>
+      <w:lvlJc w:val="left"/>
+      <w:pPr>
+        <w:tabs>
+          <w:tab w:val="num" w:pos="4320"/>
+        </w:tabs>
+        <w:ind w:left="4320" w:hanging="360"/>
+      </w:pPr>
+      <w:rPr>
+        <w:rFonts w:ascii="Wingdings" w:hAnsi="Wingdings" w:hint="default"/>
+        <w:sz w:val="20"/>
+      </w:rPr>
+    </w:lvl>
+    <w:lvl w:ilvl="6" w:tentative="1">
+      <w:start w:val="1"/>
+      <w:numFmt w:val="bullet"/>
+      <w:lvlText w:val=""/>
+      <w:lvlJc w:val="left"/>
+      <w:pPr>
+        <w:tabs>
+          <w:tab w:val="num" w:pos="5040"/>
+        </w:tabs>
+        <w:ind w:left="5040" w:hanging="360"/>
+      </w:pPr>
+      <w:rPr>
+        <w:rFonts w:ascii="Wingdings" w:hAnsi="Wingdings" w:hint="default"/>
+        <w:sz w:val="20"/>
+      </w:rPr>
+    </w:lvl>
+    <w:lvl w:ilvl="7" w:tentative="1">
+      <w:start w:val="1"/>
+      <w:numFmt w:val="bullet"/>
+      <w:lvlText w:val=""/>
+      <w:lvlJc w:val="left"/>
+      <w:pPr>
+        <w:tabs>
+          <w:tab w:val="num" w:pos="5760"/>
+        </w:tabs>
+        <w:ind w:left="5760" w:hanging="360"/>
+      </w:pPr>
+      <w:rPr>
+        <w:rFonts w:ascii="Wingdings" w:hAnsi="Wingdings" w:hint="default"/>
+        <w:sz w:val="20"/>
+      </w:rPr>
+    </w:lvl>
+    <w:lvl w:ilvl="8" w:tentative="1">
+      <w:start w:val="1"/>
+      <w:numFmt w:val="bullet"/>
+      <w:lvlText w:val=""/>
+      <w:lvlJc w:val="left"/>
+      <w:pPr>
+        <w:tabs>
+          <w:tab w:val="num" w:pos="6480"/>
+        </w:tabs>
+        <w:ind w:left="6480" w:hanging="360"/>
+      </w:pPr>
+      <w:rPr>
+        <w:rFonts w:ascii="Wingdings" w:hAnsi="Wingdings" w:hint="default"/>
+        <w:sz w:val="20"/>
+      </w:rPr>
+    </w:lvl>
+  </w:abstractNum>
+  <w:abstractNum w:abstractNumId="13" w15:restartNumberingAfterBreak="0">
     <w:nsid w:val="6B706C99"/>
     <w:multiLevelType w:val="multilevel"/>
     <w:tmpl w:val="E260FD3C"/>
@@ -2488,7 +3058,7 @@
       </w:rPr>
     </w:lvl>
   </w:abstractNum>
-  <w:abstractNum w:abstractNumId="10" w15:restartNumberingAfterBreak="0">
+  <w:abstractNum w:abstractNumId="14" w15:restartNumberingAfterBreak="0">
     <w:nsid w:val="758001A8"/>
     <w:multiLevelType w:val="hybridMultilevel"/>
     <w:tmpl w:val="8586E1BA"/>
@@ -2700,7 +3270,7 @@
       </w:rPr>
     </w:lvl>
   </w:abstractNum>
-  <w:abstractNum w:abstractNumId="11" w15:restartNumberingAfterBreak="0">
+  <w:abstractNum w:abstractNumId="15" w15:restartNumberingAfterBreak="0">
     <w:nsid w:val="7C406ADD"/>
     <w:multiLevelType w:val="hybridMultilevel"/>
     <w:tmpl w:val="F0D85162"/>
@@ -2814,40 +3384,52 @@
     </w:lvl>
   </w:abstractNum>
   <w:num w:numId="1" w16cid:durableId="1671835277">
+    <w:abstractNumId w:val="7"/>
+  </w:num>
+  <w:num w:numId="2" w16cid:durableId="1669601252">
+    <w:abstractNumId w:val="3"/>
+  </w:num>
+  <w:num w:numId="3" w16cid:durableId="1173111276">
+    <w:abstractNumId w:val="14"/>
+  </w:num>
+  <w:num w:numId="4" w16cid:durableId="1158762233">
     <w:abstractNumId w:val="5"/>
   </w:num>
-  <w:num w:numId="2" w16cid:durableId="1669601252">
+  <w:num w:numId="5" w16cid:durableId="1875118510">
+    <w:abstractNumId w:val="15"/>
+  </w:num>
+  <w:num w:numId="6" w16cid:durableId="1911840255">
+    <w:abstractNumId w:val="8"/>
+  </w:num>
+  <w:num w:numId="7" w16cid:durableId="1491092712">
+    <w:abstractNumId w:val="9"/>
+  </w:num>
+  <w:num w:numId="8" w16cid:durableId="1374767012">
+    <w:abstractNumId w:val="1"/>
+  </w:num>
+  <w:num w:numId="9" w16cid:durableId="1040402782">
+    <w:abstractNumId w:val="13"/>
+  </w:num>
+  <w:num w:numId="10" w16cid:durableId="1614169577">
     <w:abstractNumId w:val="2"/>
   </w:num>
-  <w:num w:numId="3" w16cid:durableId="1173111276">
-    <w:abstractNumId w:val="10"/>
-  </w:num>
-  <w:num w:numId="4" w16cid:durableId="1158762233">
-    <w:abstractNumId w:val="3"/>
-  </w:num>
-  <w:num w:numId="5" w16cid:durableId="1875118510">
+  <w:num w:numId="11" w16cid:durableId="2076781768">
     <w:abstractNumId w:val="11"/>
   </w:num>
-  <w:num w:numId="6" w16cid:durableId="1911840255">
+  <w:num w:numId="12" w16cid:durableId="1022048137">
     <w:abstractNumId w:val="6"/>
   </w:num>
-  <w:num w:numId="7" w16cid:durableId="1491092712">
-    <w:abstractNumId w:val="7"/>
+  <w:num w:numId="13" w16cid:durableId="1708331011">
+    <w:abstractNumId w:val="12"/>
   </w:num>
-  <w:num w:numId="8" w16cid:durableId="1374767012">
+  <w:num w:numId="14" w16cid:durableId="1915504845">
+    <w:abstractNumId w:val="4"/>
+  </w:num>
+  <w:num w:numId="15" w16cid:durableId="1373647437">
     <w:abstractNumId w:val="0"/>
   </w:num>
-  <w:num w:numId="9" w16cid:durableId="1040402782">
-    <w:abstractNumId w:val="9"/>
-  </w:num>
-  <w:num w:numId="10" w16cid:durableId="1614169577">
-    <w:abstractNumId w:val="1"/>
-  </w:num>
-  <w:num w:numId="11" w16cid:durableId="2076781768">
-    <w:abstractNumId w:val="8"/>
-  </w:num>
-  <w:num w:numId="12" w16cid:durableId="1022048137">
-    <w:abstractNumId w:val="4"/>
+  <w:num w:numId="16" w16cid:durableId="1666742431">
+    <w:abstractNumId w:val="10"/>
   </w:num>
 </w:numbering>
 </file>
@@ -3264,7 +3846,6 @@
   <w:style w:type="character" w:default="1" w:styleId="Standaardalinea-lettertype">
     <w:name w:val="Default Paragraph Font"/>
     <w:uiPriority w:val="1"/>
-    <w:semiHidden/>
     <w:unhideWhenUsed/>
   </w:style>
   <w:style w:type="table" w:default="1" w:styleId="Standaardtabel">
@@ -3298,6 +3879,24 @@
       <w:ind w:left="720"/>
       <w:contextualSpacing/>
     </w:pPr>
+  </w:style>
+  <w:style w:type="paragraph" w:styleId="Normaalweb">
+    <w:name w:val="Normal (Web)"/>
+    <w:basedOn w:val="Standaard"/>
+    <w:uiPriority w:val="99"/>
+    <w:semiHidden/>
+    <w:unhideWhenUsed/>
+    <w:rsid w:val="00D350EB"/>
+    <w:pPr>
+      <w:spacing w:before="100" w:beforeAutospacing="1" w:after="100" w:afterAutospacing="1" w:line="240" w:lineRule="auto"/>
+      <w:ind w:left="0" w:firstLine="0"/>
+    </w:pPr>
+    <w:rPr>
+      <w:rFonts w:ascii="Times New Roman" w:eastAsia="Times New Roman" w:hAnsi="Times New Roman" w:cs="Times New Roman"/>
+      <w:color w:val="auto"/>
+      <w:kern w:val="0"/>
+      <w14:ligatures w14:val="none"/>
+    </w:rPr>
   </w:style>
 </w:styles>
 </file>
@@ -3615,4 +4214,16 @@
     </a:ext>
   </a:extLst>
 </a:theme>
+</file>
+
+<file path=customXml/item1.xml><?xml version="1.0" encoding="utf-8"?>
+<b:Sources xmlns:b="http://schemas.openxmlformats.org/officeDocument/2006/bibliography" xmlns="http://schemas.openxmlformats.org/officeDocument/2006/bibliography" SelectedStyle="\APASixthEditionOfficeOnline.xsl" StyleName="APA" Version="6"/>
+</file>
+
+<file path=customXml/itemProps1.xml><?xml version="1.0" encoding="utf-8"?>
+<ds:datastoreItem xmlns:ds="http://schemas.openxmlformats.org/officeDocument/2006/customXml" ds:itemID="{804BACCA-9B99-4D11-A0F3-3AFC4E7F7128}">
+  <ds:schemaRefs>
+    <ds:schemaRef ds:uri="http://schemas.openxmlformats.org/officeDocument/2006/bibliography"/>
+  </ds:schemaRefs>
+</ds:datastoreItem>
 </file>
</xml_diff>